<commit_message>
feat(saff-study): publish specification and test suite v1.2
</commit_message>
<xml_diff>
--- a/output/docx/CRUDDiagnosticos.docx
+++ b/output/docx/CRUDDiagnosticos.docx
@@ -293,17 +293,17 @@
               <w:rPr>
                 <w:sz w:val="18"/>
               </w:rPr>
-              <w:t>system: SYSTEM: exibe lista de diagnosticos</w:t>
-            </w:r>
-          </w:p>
-        </w:tc>
-        <w:tc>
-          <w:p>
-            <w:r>
-              <w:rPr>
-                <w:sz w:val="18"/>
-              </w:rPr>
-              <w:t>exibe lista de diagnosticos</w:t>
+              <w:t>system: SYSTEM: exibe lista de diagnósticos</w:t>
+            </w:r>
+          </w:p>
+        </w:tc>
+        <w:tc>
+          <w:p>
+            <w:r>
+              <w:rPr>
+                <w:sz w:val="18"/>
+              </w:rPr>
+              <w:t>exibe lista de diagnósticos</w:t>
             </w:r>
           </w:p>
         </w:tc>
@@ -325,17 +325,17 @@
               <w:rPr>
                 <w:sz w:val="18"/>
               </w:rPr>
-              <w:t>system: SYSTEM: exibe dados do diagnostico</w:t>
-            </w:r>
-          </w:p>
-        </w:tc>
-        <w:tc>
-          <w:p>
-            <w:r>
-              <w:rPr>
-                <w:sz w:val="18"/>
-              </w:rPr>
-              <w:t>exibe dados do diagnostico</w:t>
+              <w:t>system: SYSTEM: exibe dados do diagnóstico</w:t>
+            </w:r>
+          </w:p>
+        </w:tc>
+        <w:tc>
+          <w:p>
+            <w:r>
+              <w:rPr>
+                <w:sz w:val="18"/>
+              </w:rPr>
+              <w:t>exibe dados do diagnóstico</w:t>
             </w:r>
           </w:p>
         </w:tc>
@@ -546,7 +546,7 @@
           <w:sz w:val="24"/>
           <w:color w:val="2B6CB0"/>
         </w:rPr>
-        <w:t>[TC3] Alternative Flow 1: Campo fora da formatacao esperada</w:t>
+        <w:t>[TC3] Alternative Flow 1: Campo fora da formatação esperada</w:t>
       </w:r>
     </w:p>
     <w:p>
@@ -673,17 +673,17 @@
               <w:rPr>
                 <w:sz w:val="18"/>
               </w:rPr>
-              <w:t>system: SYSTEM: exibe mensagem informando que os dados nao correspondem a formatacao esperada</w:t>
-            </w:r>
-          </w:p>
-        </w:tc>
-        <w:tc>
-          <w:p>
-            <w:r>
-              <w:rPr>
-                <w:sz w:val="18"/>
-              </w:rPr>
-              <w:t>exibe mensagem informando que os dados nao correspondem a formatacao esperada</w:t>
+              <w:t>system: SYSTEM: exibe mensagem informando que os dados nao correspondem a formatação esperada</w:t>
+            </w:r>
+          </w:p>
+        </w:tc>
+        <w:tc>
+          <w:p>
+            <w:r>
+              <w:rPr>
+                <w:sz w:val="18"/>
+              </w:rPr>
+              <w:t>exibe mensagem informando que os dados nao correspondem a formatação esperada</w:t>
             </w:r>
           </w:p>
         </w:tc>
@@ -989,17 +989,17 @@
               <w:rPr>
                 <w:sz w:val="18"/>
               </w:rPr>
-              <w:t>system: SYSTEM: exibe mensagem solicitando confirmacao</w:t>
-            </w:r>
-          </w:p>
-        </w:tc>
-        <w:tc>
-          <w:p>
-            <w:r>
-              <w:rPr>
-                <w:sz w:val="18"/>
-              </w:rPr>
-              <w:t>exibe mensagem solicitando confirmacao</w:t>
+              <w:t>system: SYSTEM: exibe mensagem solicitando confirmaçao</w:t>
+            </w:r>
+          </w:p>
+        </w:tc>
+        <w:tc>
+          <w:p>
+            <w:r>
+              <w:rPr>
+                <w:sz w:val="18"/>
+              </w:rPr>
+              <w:t>exibe mensagem solicitando confirmaçao</w:t>
             </w:r>
           </w:p>
         </w:tc>

</xml_diff>